<commit_message>
DB S3 URL 저장 및 Presigned URL 할당
</commit_message>
<xml_diff>
--- a/report_agent/output/risk_assessment_form/2026-08-05/risk_assessment_form_filled_2026-08-05.docx
+++ b/report_agent/output/risk_assessment_form/2026-08-05/risk_assessment_form_filled_2026-08-05.docx
@@ -3008,7 +3008,7 @@
                 <w:sz w:val="12"/>
                 <w:szCs w:val="12"/>
               </w:rPr>
-              <w:t>게시판-조치테이블-담당자 배정 보고서 생성</w:t>
+              <w:t>게시판 - 조치 테이블 - 담당자 배정 보고서 생성</w:t>
             </w:r>
           </w:p>
         </w:tc>
@@ -3180,7 +3180,7 @@
                 <w:sz w:val="12"/>
                 <w:szCs w:val="12"/>
               </w:rPr>
-              <w:t>지원 요청했다.</w:t>
+              <w:t>지원 요청을 접수했다.</w:t>
             </w:r>
           </w:p>
         </w:tc>
@@ -4301,7 +4301,7 @@
                 <w:sz w:val="12"/>
                 <w:szCs w:val="12"/>
               </w:rPr>
-              <w:t>리포트 이상 현상</w:t>
+              <w:t>보고서 이상 현상</w:t>
             </w:r>
           </w:p>
         </w:tc>
@@ -4473,7 +4473,7 @@
                 <w:sz w:val="12"/>
                 <w:szCs w:val="12"/>
               </w:rPr>
-              <w:t>조치를 완료했다.</w:t>
+              <w:t>문제를 해결했다.</w:t>
             </w:r>
           </w:p>
         </w:tc>

</xml_diff>